<commit_message>
add 2nd ML Model with 2 external API key.
</commit_message>
<xml_diff>
--- a/PROJECT_REPORT.docx
+++ b/PROJECT_REPORT.docx
@@ -292,7 +292,6 @@
         <w:pStyle w:val="ListBullet"/>
       </w:pPr>
       <w:r>
-        <w:lastRenderedPageBreak/>
         <w:t>URL Normalization: Automatically prepends http:// if scheme is missing.</w:t>
       </w:r>
     </w:p>
@@ -462,6 +461,7 @@
               <w:rPr>
                 <w:sz w:val="20"/>
               </w:rPr>
+              <w:lastRenderedPageBreak/>
               <w:t>POST</w:t>
             </w:r>
           </w:p>
@@ -1051,7 +1051,6 @@
         <w:rPr>
           <w:color w:val="2E74B5"/>
         </w:rPr>
-        <w:lastRenderedPageBreak/>
         <w:t>4.4  Threat Intelligence — threat_intel/api_checker.py</w:t>
       </w:r>
     </w:p>
@@ -1096,6 +1095,7 @@
     </w:p>
     <w:p>
       <w:r>
+        <w:lastRenderedPageBreak/>
         <w:t>Provides geolocation and threat intelligence per IP. Returns country, city, coordinates, is_tor, is_proxy, is_anonymous, and is_attacker flags.</w:t>
       </w:r>
     </w:p>
@@ -1494,7 +1494,6 @@
         <w:pStyle w:val="ListBullet"/>
       </w:pPr>
       <w:r>
-        <w:lastRenderedPageBreak/>
         <w:t>Expandable sections: ML details, VirusTotal, AbuseIPDB, IPStack (with world map), HTML features.</w:t>
       </w:r>
     </w:p>
@@ -1686,6 +1685,7 @@
               <w:rPr>
                 <w:sz w:val="20"/>
               </w:rPr>
+              <w:lastRenderedPageBreak/>
               <w:t>API</w:t>
             </w:r>
           </w:p>
@@ -2105,7 +2105,6 @@
         <w:rPr>
           <w:color w:val="1F497D"/>
         </w:rPr>
-        <w:lastRenderedPageBreak/>
         <w:t>7. Deployment</w:t>
       </w:r>
     </w:p>
@@ -2301,6 +2300,7 @@
         <w:rPr>
           <w:color w:val="1F497D"/>
         </w:rPr>
+        <w:lastRenderedPageBreak/>
         <w:t>9. Limitations &amp; Future Improvements</w:t>
       </w:r>
     </w:p>
@@ -2530,6 +2530,11 @@
     <w:p>
       <w:pPr>
         <w:ind w:left="432"/>
+        <w:rPr>
+          <w:rFonts w:ascii="Courier New" w:hAnsi="Courier New"/>
+          <w:color w:val="1E1E1E"/>
+          <w:sz w:val="18"/>
+        </w:rPr>
       </w:pPr>
       <w:r>
         <w:rPr>
@@ -2573,14 +2578,6 @@
           <w:sz w:val="18"/>
         </w:rPr>
         <w:br/>
-      </w:r>
-      <w:r>
-        <w:rPr>
-          <w:rFonts w:ascii="Courier New" w:hAnsi="Courier New"/>
-          <w:color w:val="1E1E1E"/>
-          <w:sz w:val="18"/>
-        </w:rPr>
-        <w:lastRenderedPageBreak/>
         <w:t>│   └── engine.py            # Scoring logic, label thresholds</w:t>
       </w:r>
       <w:r>
@@ -2727,10 +2724,1330 @@
         <w:br/>
         <w:t>└── requirements.txt         # Python dependencies</w:t>
       </w:r>
+    </w:p>
+    <w:p>
+      <w:pPr>
+        <w:ind w:left="432"/>
+        <w:rPr>
+          <w:rFonts w:ascii="Courier New" w:hAnsi="Courier New"/>
+          <w:color w:val="1E1E1E"/>
+          <w:sz w:val="18"/>
+        </w:rPr>
+      </w:pPr>
+    </w:p>
+    <w:p>
+      <w:pPr>
+        <w:ind w:left="432"/>
+        <w:rPr>
+          <w:rFonts w:ascii="Courier New" w:hAnsi="Courier New"/>
+          <w:color w:val="1E1E1E"/>
+          <w:sz w:val="18"/>
+        </w:rPr>
+      </w:pPr>
+    </w:p>
+    <w:p>
+      <w:pPr>
+        <w:ind w:left="432"/>
+        <w:rPr>
+          <w:rFonts w:ascii="Courier New" w:hAnsi="Courier New"/>
+          <w:color w:val="1E1E1E"/>
+          <w:sz w:val="18"/>
+        </w:rPr>
+      </w:pPr>
+    </w:p>
+    <w:p>
+      <w:pPr>
+        <w:ind w:left="432"/>
+        <w:rPr>
+          <w:rFonts w:ascii="Courier New" w:hAnsi="Courier New"/>
+          <w:color w:val="1E1E1E"/>
+          <w:sz w:val="18"/>
+        </w:rPr>
+      </w:pPr>
+    </w:p>
+    <w:p>
+      <w:pPr>
+        <w:ind w:left="432"/>
+        <w:rPr>
+          <w:rFonts w:ascii="Courier New" w:hAnsi="Courier New"/>
+          <w:color w:val="1E1E1E"/>
+          <w:sz w:val="18"/>
+        </w:rPr>
+      </w:pPr>
+    </w:p>
+    <w:p>
+      <w:pPr>
+        <w:ind w:left="432"/>
+        <w:rPr>
+          <w:rFonts w:ascii="Courier New" w:hAnsi="Courier New"/>
+          <w:color w:val="1E1E1E"/>
+          <w:sz w:val="18"/>
+        </w:rPr>
+      </w:pPr>
+    </w:p>
+    <w:p>
+      <w:pPr>
+        <w:ind w:left="432"/>
+        <w:rPr>
+          <w:rFonts w:ascii="Courier New" w:hAnsi="Courier New"/>
+          <w:color w:val="1E1E1E"/>
+          <w:sz w:val="18"/>
+        </w:rPr>
+      </w:pPr>
+    </w:p>
+    <w:p>
+      <w:pPr>
+        <w:ind w:left="432"/>
+        <w:rPr>
+          <w:rFonts w:ascii="Courier New" w:hAnsi="Courier New"/>
+          <w:color w:val="1E1E1E"/>
+          <w:sz w:val="18"/>
+        </w:rPr>
+      </w:pPr>
+    </w:p>
+    <w:p>
+      <w:pPr>
+        <w:ind w:left="432"/>
+        <w:rPr>
+          <w:rFonts w:ascii="Courier New" w:hAnsi="Courier New"/>
+          <w:color w:val="1E1E1E"/>
+          <w:sz w:val="18"/>
+        </w:rPr>
+      </w:pPr>
+    </w:p>
+    <w:p>
+      <w:pPr>
+        <w:ind w:left="432"/>
+        <w:rPr>
+          <w:rFonts w:ascii="Courier New" w:hAnsi="Courier New"/>
+          <w:color w:val="1E1E1E"/>
+          <w:sz w:val="18"/>
+        </w:rPr>
+      </w:pPr>
+    </w:p>
+    <w:p>
+      <w:pPr>
+        <w:ind w:left="432"/>
+        <w:rPr>
+          <w:rFonts w:ascii="Courier New" w:hAnsi="Courier New"/>
+          <w:color w:val="1E1E1E"/>
+          <w:sz w:val="18"/>
+        </w:rPr>
+      </w:pPr>
+    </w:p>
+    <w:p>
+      <w:pPr>
+        <w:ind w:left="432"/>
+        <w:rPr>
+          <w:rFonts w:ascii="Courier New" w:hAnsi="Courier New"/>
+          <w:color w:val="1E1E1E"/>
+          <w:sz w:val="18"/>
+        </w:rPr>
+      </w:pPr>
+    </w:p>
+    <w:p>
+      <w:pPr>
+        <w:ind w:left="432"/>
+        <w:rPr>
+          <w:rFonts w:ascii="Courier New" w:hAnsi="Courier New"/>
+          <w:color w:val="1E1E1E"/>
+          <w:sz w:val="18"/>
+        </w:rPr>
+      </w:pPr>
+    </w:p>
+    <w:p>
+      <w:pPr>
+        <w:ind w:left="432"/>
+        <w:rPr>
+          <w:rFonts w:ascii="Courier New" w:hAnsi="Courier New"/>
+          <w:color w:val="1E1E1E"/>
+          <w:sz w:val="18"/>
+        </w:rPr>
+      </w:pPr>
+      <w:r>
+        <w:rPr>
+          <w:rFonts w:ascii="Courier New" w:hAnsi="Courier New"/>
+          <w:color w:val="1E1E1E"/>
+          <w:sz w:val="18"/>
+        </w:rPr>
+        <w:lastRenderedPageBreak/>
+        <w:t xml:space="preserve">Problems I am facing </w:t>
+      </w:r>
+    </w:p>
+    <w:p>
+      <w:pPr>
+        <w:ind w:left="432"/>
+        <w:rPr>
+          <w:rFonts w:ascii="Courier New" w:hAnsi="Courier New"/>
+          <w:color w:val="1E1E1E"/>
+          <w:sz w:val="18"/>
+        </w:rPr>
+      </w:pPr>
+      <w:r>
+        <w:rPr>
+          <w:rFonts w:ascii="Courier New" w:hAnsi="Courier New"/>
+          <w:color w:val="1E1E1E"/>
+          <w:sz w:val="18"/>
+        </w:rPr>
+        <w:t>https://github.com/Manvikamboz/phishing-detection</w:t>
+      </w:r>
+    </w:p>
+    <w:p>
+      <w:pPr>
+        <w:ind w:left="432"/>
+        <w:rPr>
+          <w:rFonts w:ascii="Courier New" w:hAnsi="Courier New"/>
+          <w:color w:val="1E1E1E"/>
+          <w:sz w:val="18"/>
+        </w:rPr>
+      </w:pPr>
+      <w:r>
+        <w:rPr>
+          <w:rFonts w:ascii="Courier New" w:hAnsi="Courier New"/>
+          <w:color w:val="1E1E1E"/>
+          <w:sz w:val="18"/>
+        </w:rPr>
+        <w:t> gets a high score of 92:</w:t>
+      </w:r>
+    </w:p>
+    <w:p>
+      <w:pPr>
+        <w:ind w:left="432"/>
+        <w:rPr>
+          <w:rFonts w:ascii="Courier New" w:hAnsi="Courier New"/>
+          <w:color w:val="1E1E1E"/>
+          <w:sz w:val="18"/>
+        </w:rPr>
+      </w:pPr>
+      <w:r>
+        <w:rPr>
+          <w:rFonts w:ascii="Courier New" w:hAnsi="Courier New"/>
+          <w:b/>
+          <w:bCs/>
+          <w:color w:val="1E1E1E"/>
+          <w:sz w:val="18"/>
+        </w:rPr>
+        <w:t>Root causes — multiple signals stacking up:</w:t>
+      </w:r>
+    </w:p>
+    <w:p>
+      <w:pPr>
+        <w:ind w:left="432"/>
+        <w:rPr>
+          <w:rFonts w:ascii="Courier New" w:hAnsi="Courier New"/>
+          <w:color w:val="1E1E1E"/>
+          <w:sz w:val="18"/>
+        </w:rPr>
+      </w:pPr>
+      <w:r>
+        <w:rPr>
+          <w:rFonts w:ascii="Courier New" w:hAnsi="Courier New"/>
+          <w:b/>
+          <w:bCs/>
+          <w:color w:val="1E1E1E"/>
+          <w:sz w:val="18"/>
+        </w:rPr>
+        <w:t>1. ML Model bias (biggest contributor)</w:t>
+      </w:r>
+      <w:r>
+        <w:rPr>
+          <w:rFonts w:ascii="Courier New" w:hAnsi="Courier New"/>
+          <w:color w:val="1E1E1E"/>
+          <w:sz w:val="18"/>
+        </w:rPr>
+        <w:br/>
+        <w:t>The model was trained on a dataset where features like </w:t>
+      </w:r>
+    </w:p>
+    <w:p>
+      <w:pPr>
+        <w:ind w:left="432"/>
+        <w:rPr>
+          <w:rFonts w:ascii="Courier New" w:hAnsi="Courier New"/>
+          <w:color w:val="1E1E1E"/>
+          <w:sz w:val="18"/>
+        </w:rPr>
+      </w:pPr>
+      <w:proofErr w:type="spellStart"/>
+      <w:r>
+        <w:rPr>
+          <w:rFonts w:ascii="Courier New" w:hAnsi="Courier New"/>
+          <w:color w:val="1E1E1E"/>
+          <w:sz w:val="18"/>
+        </w:rPr>
+        <w:t>domain_age</w:t>
+      </w:r>
+      <w:proofErr w:type="spellEnd"/>
+      <w:r>
+        <w:rPr>
+          <w:rFonts w:ascii="Courier New" w:hAnsi="Courier New"/>
+          <w:color w:val="1E1E1E"/>
+          <w:sz w:val="18"/>
+        </w:rPr>
+        <w:t>=0</w:t>
+      </w:r>
+    </w:p>
+    <w:p>
+      <w:pPr>
+        <w:ind w:left="432"/>
+        <w:rPr>
+          <w:rFonts w:ascii="Courier New" w:hAnsi="Courier New"/>
+          <w:color w:val="1E1E1E"/>
+          <w:sz w:val="18"/>
+        </w:rPr>
+      </w:pPr>
+      <w:r>
+        <w:rPr>
+          <w:rFonts w:ascii="Courier New" w:hAnsi="Courier New"/>
+          <w:color w:val="1E1E1E"/>
+          <w:sz w:val="18"/>
+        </w:rPr>
+        <w:t>, </w:t>
+      </w:r>
+    </w:p>
+    <w:p>
+      <w:pPr>
+        <w:ind w:left="432"/>
+        <w:rPr>
+          <w:rFonts w:ascii="Courier New" w:hAnsi="Courier New"/>
+          <w:color w:val="1E1E1E"/>
+          <w:sz w:val="18"/>
+        </w:rPr>
+      </w:pPr>
+      <w:proofErr w:type="spellStart"/>
+      <w:r>
+        <w:rPr>
+          <w:rFonts w:ascii="Courier New" w:hAnsi="Courier New"/>
+          <w:color w:val="1E1E1E"/>
+          <w:sz w:val="18"/>
+        </w:rPr>
+        <w:t>web_traffic</w:t>
+      </w:r>
+      <w:proofErr w:type="spellEnd"/>
+      <w:r>
+        <w:rPr>
+          <w:rFonts w:ascii="Courier New" w:hAnsi="Courier New"/>
+          <w:color w:val="1E1E1E"/>
+          <w:sz w:val="18"/>
+        </w:rPr>
+        <w:t>=0</w:t>
+      </w:r>
+    </w:p>
+    <w:p>
+      <w:pPr>
+        <w:ind w:left="432"/>
+        <w:rPr>
+          <w:rFonts w:ascii="Courier New" w:hAnsi="Courier New"/>
+          <w:color w:val="1E1E1E"/>
+          <w:sz w:val="18"/>
+        </w:rPr>
+      </w:pPr>
+      <w:r>
+        <w:rPr>
+          <w:rFonts w:ascii="Courier New" w:hAnsi="Courier New"/>
+          <w:color w:val="1E1E1E"/>
+          <w:sz w:val="18"/>
+        </w:rPr>
+        <w:t>, </w:t>
+      </w:r>
+    </w:p>
+    <w:p>
+      <w:pPr>
+        <w:ind w:left="432"/>
+        <w:rPr>
+          <w:rFonts w:ascii="Courier New" w:hAnsi="Courier New"/>
+          <w:color w:val="1E1E1E"/>
+          <w:sz w:val="18"/>
+        </w:rPr>
+      </w:pPr>
+      <w:proofErr w:type="spellStart"/>
+      <w:r>
+        <w:rPr>
+          <w:rFonts w:ascii="Courier New" w:hAnsi="Courier New"/>
+          <w:color w:val="1E1E1E"/>
+          <w:sz w:val="18"/>
+        </w:rPr>
+        <w:t>google_index</w:t>
+      </w:r>
+      <w:proofErr w:type="spellEnd"/>
+      <w:r>
+        <w:rPr>
+          <w:rFonts w:ascii="Courier New" w:hAnsi="Courier New"/>
+          <w:color w:val="1E1E1E"/>
+          <w:sz w:val="18"/>
+        </w:rPr>
+        <w:t>=0</w:t>
+      </w:r>
+    </w:p>
+    <w:p>
+      <w:pPr>
+        <w:ind w:left="432"/>
+        <w:rPr>
+          <w:rFonts w:ascii="Courier New" w:hAnsi="Courier New"/>
+          <w:color w:val="1E1E1E"/>
+          <w:sz w:val="18"/>
+        </w:rPr>
+      </w:pPr>
+      <w:r>
+        <w:rPr>
+          <w:rFonts w:ascii="Courier New" w:hAnsi="Courier New"/>
+          <w:color w:val="1E1E1E"/>
+          <w:sz w:val="18"/>
+        </w:rPr>
+        <w:t>, </w:t>
+      </w:r>
+    </w:p>
+    <w:p>
+      <w:pPr>
+        <w:ind w:left="432"/>
+        <w:rPr>
+          <w:rFonts w:ascii="Courier New" w:hAnsi="Courier New"/>
+          <w:color w:val="1E1E1E"/>
+          <w:sz w:val="18"/>
+        </w:rPr>
+      </w:pPr>
+      <w:proofErr w:type="spellStart"/>
+      <w:r>
+        <w:rPr>
+          <w:rFonts w:ascii="Courier New" w:hAnsi="Courier New"/>
+          <w:color w:val="1E1E1E"/>
+          <w:sz w:val="18"/>
+        </w:rPr>
+        <w:t>page_rank</w:t>
+      </w:r>
+      <w:proofErr w:type="spellEnd"/>
+      <w:r>
+        <w:rPr>
+          <w:rFonts w:ascii="Courier New" w:hAnsi="Courier New"/>
+          <w:color w:val="1E1E1E"/>
+          <w:sz w:val="18"/>
+        </w:rPr>
+        <w:t>=0</w:t>
+      </w:r>
+    </w:p>
+    <w:p>
+      <w:pPr>
+        <w:ind w:left="432"/>
+        <w:rPr>
+          <w:rFonts w:ascii="Courier New" w:hAnsi="Courier New"/>
+          <w:color w:val="1E1E1E"/>
+          <w:sz w:val="18"/>
+        </w:rPr>
+      </w:pPr>
+      <w:r>
+        <w:rPr>
+          <w:rFonts w:ascii="Courier New" w:hAnsi="Courier New"/>
+          <w:color w:val="1E1E1E"/>
+          <w:sz w:val="18"/>
+        </w:rPr>
+        <w:t> are hardcoded to 0 in </w:t>
+      </w:r>
+    </w:p>
+    <w:p>
+      <w:pPr>
+        <w:ind w:left="432"/>
+        <w:rPr>
+          <w:rFonts w:ascii="Courier New" w:hAnsi="Courier New"/>
+          <w:color w:val="1E1E1E"/>
+          <w:sz w:val="18"/>
+        </w:rPr>
+      </w:pPr>
+      <w:r>
+        <w:rPr>
+          <w:rFonts w:ascii="Courier New" w:hAnsi="Courier New"/>
+          <w:color w:val="1E1E1E"/>
+          <w:sz w:val="18"/>
+        </w:rPr>
+        <w:t>predict.py</w:t>
+      </w:r>
+    </w:p>
+    <w:p>
+      <w:pPr>
+        <w:ind w:left="432"/>
+        <w:rPr>
+          <w:rFonts w:ascii="Courier New" w:hAnsi="Courier New"/>
+          <w:color w:val="1E1E1E"/>
+          <w:sz w:val="18"/>
+        </w:rPr>
+      </w:pPr>
+      <w:r>
+        <w:rPr>
+          <w:rFonts w:ascii="Courier New" w:hAnsi="Courier New"/>
+          <w:color w:val="1E1E1E"/>
+          <w:sz w:val="18"/>
+        </w:rPr>
+        <w:t> (lines ~230-235) because you don't have paid APIs. These zero values are strong phishing indicators in the training data, so the model is biased against any URL where these can't be fetched.</w:t>
+      </w:r>
+    </w:p>
+    <w:p>
+      <w:pPr>
+        <w:ind w:left="432"/>
+        <w:rPr>
+          <w:rFonts w:ascii="Courier New" w:hAnsi="Courier New"/>
+          <w:b/>
+          <w:bCs/>
+          <w:color w:val="1E1E1E"/>
+          <w:sz w:val="18"/>
+        </w:rPr>
+      </w:pPr>
+      <w:r>
+        <w:rPr>
+          <w:rFonts w:ascii="Courier New" w:hAnsi="Courier New"/>
+          <w:b/>
+          <w:bCs/>
+          <w:color w:val="1E1E1E"/>
+          <w:sz w:val="18"/>
+        </w:rPr>
+        <w:t>2. URL heuristics in </w:t>
+      </w:r>
+    </w:p>
+    <w:p>
+      <w:pPr>
+        <w:ind w:left="432"/>
+        <w:rPr>
+          <w:rFonts w:ascii="Courier New" w:hAnsi="Courier New"/>
+          <w:color w:val="1E1E1E"/>
+          <w:sz w:val="18"/>
+        </w:rPr>
+      </w:pPr>
+      <w:r>
+        <w:rPr>
+          <w:rFonts w:ascii="Courier New" w:hAnsi="Courier New"/>
+          <w:b/>
+          <w:bCs/>
+          <w:color w:val="1E1E1E"/>
+          <w:sz w:val="18"/>
+        </w:rPr>
+        <w:t>engine.py</w:t>
+      </w:r>
+    </w:p>
+    <w:p>
+      <w:pPr>
+        <w:ind w:left="432"/>
+        <w:rPr>
+          <w:rFonts w:ascii="Courier New" w:hAnsi="Courier New"/>
+          <w:color w:val="1E1E1E"/>
+          <w:sz w:val="18"/>
+        </w:rPr>
+      </w:pPr>
+      <w:r>
+        <w:rPr>
+          <w:rFonts w:ascii="Courier New" w:hAnsi="Courier New"/>
+          <w:b/>
+          <w:bCs/>
+          <w:color w:val="1E1E1E"/>
+          <w:sz w:val="18"/>
+        </w:rPr>
+        <w:t> firing incorrectly</w:t>
+      </w:r>
+      <w:r>
+        <w:rPr>
+          <w:rFonts w:ascii="Courier New" w:hAnsi="Courier New"/>
+          <w:color w:val="1E1E1E"/>
+          <w:sz w:val="18"/>
+        </w:rPr>
+        <w:br/>
+        <w:t>For </w:t>
+      </w:r>
+    </w:p>
+    <w:p>
+      <w:pPr>
+        <w:ind w:left="432"/>
+        <w:rPr>
+          <w:rFonts w:ascii="Courier New" w:hAnsi="Courier New"/>
+          <w:color w:val="1E1E1E"/>
+          <w:sz w:val="18"/>
+        </w:rPr>
+      </w:pPr>
+      <w:r>
+        <w:rPr>
+          <w:rFonts w:ascii="Courier New" w:hAnsi="Courier New"/>
+          <w:color w:val="1E1E1E"/>
+          <w:sz w:val="18"/>
+        </w:rPr>
+        <w:t>github.com/</w:t>
+      </w:r>
+      <w:proofErr w:type="spellStart"/>
+      <w:r>
+        <w:rPr>
+          <w:rFonts w:ascii="Courier New" w:hAnsi="Courier New"/>
+          <w:color w:val="1E1E1E"/>
+          <w:sz w:val="18"/>
+        </w:rPr>
+        <w:t>Manvikamboz</w:t>
+      </w:r>
+      <w:proofErr w:type="spellEnd"/>
+      <w:r>
+        <w:rPr>
+          <w:rFonts w:ascii="Courier New" w:hAnsi="Courier New"/>
+          <w:color w:val="1E1E1E"/>
+          <w:sz w:val="18"/>
+        </w:rPr>
+        <w:t>/phishing-detection</w:t>
+      </w:r>
+    </w:p>
+    <w:p>
+      <w:pPr>
+        <w:ind w:left="432"/>
+        <w:rPr>
+          <w:rFonts w:ascii="Courier New" w:hAnsi="Courier New"/>
+          <w:color w:val="1E1E1E"/>
+          <w:sz w:val="18"/>
+        </w:rPr>
+      </w:pPr>
+      <w:r>
+        <w:rPr>
+          <w:rFonts w:ascii="Courier New" w:hAnsi="Courier New"/>
+          <w:color w:val="1E1E1E"/>
+          <w:sz w:val="18"/>
+        </w:rPr>
+        <w:t>:</w:t>
+      </w:r>
+    </w:p>
+    <w:p>
+      <w:pPr>
+        <w:numPr>
+          <w:ilvl w:val="0"/>
+          <w:numId w:val="10"/>
+        </w:numPr>
+        <w:rPr>
+          <w:rFonts w:ascii="Courier New" w:hAnsi="Courier New"/>
+          <w:color w:val="1E1E1E"/>
+          <w:sz w:val="18"/>
+        </w:rPr>
+      </w:pPr>
+      <w:r>
+        <w:rPr>
+          <w:rFonts w:ascii="Courier New" w:hAnsi="Courier New"/>
+          <w:color w:val="1E1E1E"/>
+          <w:sz w:val="18"/>
+        </w:rPr>
+        <w:t>"phishing"</w:t>
+      </w:r>
+    </w:p>
+    <w:p>
+      <w:pPr>
+        <w:ind w:left="432"/>
+        <w:rPr>
+          <w:rFonts w:ascii="Courier New" w:hAnsi="Courier New"/>
+          <w:color w:val="1E1E1E"/>
+          <w:sz w:val="18"/>
+        </w:rPr>
+      </w:pPr>
+      <w:r>
+        <w:rPr>
+          <w:rFonts w:ascii="Courier New" w:hAnsi="Courier New"/>
+          <w:color w:val="1E1E1E"/>
+          <w:sz w:val="18"/>
+        </w:rPr>
+        <w:t> keyword in the path → </w:t>
+      </w:r>
+    </w:p>
+    <w:p>
+      <w:pPr>
+        <w:ind w:left="432"/>
+        <w:rPr>
+          <w:rFonts w:ascii="Courier New" w:hAnsi="Courier New"/>
+          <w:color w:val="1E1E1E"/>
+          <w:sz w:val="18"/>
+        </w:rPr>
+      </w:pPr>
+      <w:proofErr w:type="spellStart"/>
+      <w:r>
+        <w:rPr>
+          <w:rFonts w:ascii="Courier New" w:hAnsi="Courier New"/>
+          <w:color w:val="1E1E1E"/>
+          <w:sz w:val="18"/>
+        </w:rPr>
+        <w:t>phish_hints</w:t>
+      </w:r>
+      <w:proofErr w:type="spellEnd"/>
+    </w:p>
+    <w:p>
+      <w:pPr>
+        <w:ind w:left="432"/>
+        <w:rPr>
+          <w:rFonts w:ascii="Courier New" w:hAnsi="Courier New"/>
+          <w:color w:val="1E1E1E"/>
+          <w:sz w:val="18"/>
+        </w:rPr>
+      </w:pPr>
+      <w:r>
+        <w:rPr>
+          <w:rFonts w:ascii="Courier New" w:hAnsi="Courier New"/>
+          <w:color w:val="1E1E1E"/>
+          <w:sz w:val="18"/>
+        </w:rPr>
+        <w:t> regex matches → </w:t>
+      </w:r>
+    </w:p>
+    <w:p>
+      <w:pPr>
+        <w:ind w:left="432"/>
+        <w:rPr>
+          <w:rFonts w:ascii="Courier New" w:hAnsi="Courier New"/>
+          <w:color w:val="1E1E1E"/>
+          <w:sz w:val="18"/>
+        </w:rPr>
+      </w:pPr>
+      <w:r>
+        <w:rPr>
+          <w:rFonts w:ascii="Courier New" w:hAnsi="Courier New"/>
+          <w:color w:val="1E1E1E"/>
+          <w:sz w:val="18"/>
+        </w:rPr>
+        <w:t>+</w:t>
+      </w:r>
+      <w:proofErr w:type="spellStart"/>
+      <w:r>
+        <w:rPr>
+          <w:rFonts w:ascii="Courier New" w:hAnsi="Courier New"/>
+          <w:color w:val="1E1E1E"/>
+          <w:sz w:val="18"/>
+        </w:rPr>
+        <w:t>log_odds</w:t>
+      </w:r>
+      <w:proofErr w:type="spellEnd"/>
+    </w:p>
+    <w:p>
+      <w:pPr>
+        <w:numPr>
+          <w:ilvl w:val="0"/>
+          <w:numId w:val="10"/>
+        </w:numPr>
+        <w:rPr>
+          <w:rFonts w:ascii="Courier New" w:hAnsi="Courier New"/>
+          <w:color w:val="1E1E1E"/>
+          <w:sz w:val="18"/>
+        </w:rPr>
+      </w:pPr>
+      <w:r>
+        <w:rPr>
+          <w:rFonts w:ascii="Courier New" w:hAnsi="Courier New"/>
+          <w:color w:val="1E1E1E"/>
+          <w:sz w:val="18"/>
+        </w:rPr>
+        <w:t>The word </w:t>
+      </w:r>
+    </w:p>
+    <w:p>
+      <w:pPr>
+        <w:ind w:left="432"/>
+        <w:rPr>
+          <w:rFonts w:ascii="Courier New" w:hAnsi="Courier New"/>
+          <w:color w:val="1E1E1E"/>
+          <w:sz w:val="18"/>
+        </w:rPr>
+      </w:pPr>
+      <w:r>
+        <w:rPr>
+          <w:rFonts w:ascii="Courier New" w:hAnsi="Courier New"/>
+          <w:color w:val="1E1E1E"/>
+          <w:sz w:val="18"/>
+        </w:rPr>
+        <w:t>"detection"</w:t>
+      </w:r>
+    </w:p>
+    <w:p>
+      <w:pPr>
+        <w:ind w:left="432"/>
+        <w:rPr>
+          <w:rFonts w:ascii="Courier New" w:hAnsi="Courier New"/>
+          <w:color w:val="1E1E1E"/>
+          <w:sz w:val="18"/>
+        </w:rPr>
+      </w:pPr>
+      <w:r>
+        <w:rPr>
+          <w:rFonts w:ascii="Courier New" w:hAnsi="Courier New"/>
+          <w:color w:val="1E1E1E"/>
+          <w:sz w:val="18"/>
+        </w:rPr>
+        <w:t> doesn't help either</w:t>
+      </w:r>
+    </w:p>
+    <w:p>
+      <w:pPr>
+        <w:numPr>
+          <w:ilvl w:val="0"/>
+          <w:numId w:val="10"/>
+        </w:numPr>
+        <w:rPr>
+          <w:rFonts w:ascii="Courier New" w:hAnsi="Courier New"/>
+          <w:color w:val="1E1E1E"/>
+          <w:sz w:val="18"/>
+        </w:rPr>
+      </w:pPr>
+      <w:proofErr w:type="spellStart"/>
+      <w:r>
+        <w:rPr>
+          <w:rFonts w:ascii="Courier New" w:hAnsi="Courier New"/>
+          <w:color w:val="1E1E1E"/>
+          <w:sz w:val="18"/>
+        </w:rPr>
+        <w:t>brand_in_path</w:t>
+      </w:r>
+      <w:proofErr w:type="spellEnd"/>
+    </w:p>
+    <w:p>
+      <w:pPr>
+        <w:ind w:left="432"/>
+        <w:rPr>
+          <w:rFonts w:ascii="Courier New" w:hAnsi="Courier New"/>
+          <w:color w:val="1E1E1E"/>
+          <w:sz w:val="18"/>
+        </w:rPr>
+      </w:pPr>
+      <w:r>
+        <w:rPr>
+          <w:rFonts w:ascii="Courier New" w:hAnsi="Courier New"/>
+          <w:color w:val="1E1E1E"/>
+          <w:sz w:val="18"/>
+        </w:rPr>
+        <w:t> check: </w:t>
+      </w:r>
+    </w:p>
+    <w:p>
+      <w:pPr>
+        <w:ind w:left="432"/>
+        <w:rPr>
+          <w:rFonts w:ascii="Courier New" w:hAnsi="Courier New"/>
+          <w:color w:val="1E1E1E"/>
+          <w:sz w:val="18"/>
+        </w:rPr>
+      </w:pPr>
+      <w:proofErr w:type="spellStart"/>
+      <w:r>
+        <w:rPr>
+          <w:rFonts w:ascii="Courier New" w:hAnsi="Courier New"/>
+          <w:color w:val="1E1E1E"/>
+          <w:sz w:val="18"/>
+        </w:rPr>
+        <w:t>github</w:t>
+      </w:r>
+      <w:proofErr w:type="spellEnd"/>
+    </w:p>
+    <w:p>
+      <w:pPr>
+        <w:ind w:left="432"/>
+        <w:rPr>
+          <w:rFonts w:ascii="Courier New" w:hAnsi="Courier New"/>
+          <w:color w:val="1E1E1E"/>
+          <w:sz w:val="18"/>
+        </w:rPr>
+      </w:pPr>
+      <w:r>
+        <w:rPr>
+          <w:rFonts w:ascii="Courier New" w:hAnsi="Courier New"/>
+          <w:color w:val="1E1E1E"/>
+          <w:sz w:val="18"/>
+        </w:rPr>
+        <w:lastRenderedPageBreak/>
+        <w:t> isn't </w:t>
+      </w:r>
+      <w:proofErr w:type="gramStart"/>
+      <w:r>
+        <w:rPr>
+          <w:rFonts w:ascii="Courier New" w:hAnsi="Courier New"/>
+          <w:color w:val="1E1E1E"/>
+          <w:sz w:val="18"/>
+        </w:rPr>
+        <w:t>in</w:t>
+      </w:r>
+      <w:proofErr w:type="gramEnd"/>
+      <w:r>
+        <w:rPr>
+          <w:rFonts w:ascii="Courier New" w:hAnsi="Courier New"/>
+          <w:color w:val="1E1E1E"/>
+          <w:sz w:val="18"/>
+        </w:rPr>
+        <w:t> your brand list, but the path analysis still runs</w:t>
+      </w:r>
+    </w:p>
+    <w:p>
+      <w:pPr>
+        <w:ind w:left="432"/>
+        <w:rPr>
+          <w:rFonts w:ascii="Courier New" w:hAnsi="Courier New"/>
+          <w:color w:val="1E1E1E"/>
+          <w:sz w:val="18"/>
+        </w:rPr>
+      </w:pPr>
+      <w:r>
+        <w:rPr>
+          <w:rFonts w:ascii="Courier New" w:hAnsi="Courier New"/>
+          <w:b/>
+          <w:bCs/>
+          <w:color w:val="1E1E1E"/>
+          <w:sz w:val="18"/>
+        </w:rPr>
+        <w:t>3. HTML scraping results</w:t>
+      </w:r>
+      <w:r>
+        <w:rPr>
+          <w:rFonts w:ascii="Courier New" w:hAnsi="Courier New"/>
+          <w:color w:val="1E1E1E"/>
+          <w:sz w:val="18"/>
+        </w:rPr>
+        <w:br/>
+        <w:t>GitHub's repo page has many external scripts, external CSS, and links — these inflate </w:t>
+      </w:r>
+    </w:p>
+    <w:p>
+      <w:pPr>
+        <w:ind w:left="432"/>
+        <w:rPr>
+          <w:rFonts w:ascii="Courier New" w:hAnsi="Courier New"/>
+          <w:color w:val="1E1E1E"/>
+          <w:sz w:val="18"/>
+        </w:rPr>
+      </w:pPr>
+      <w:proofErr w:type="spellStart"/>
+      <w:r>
+        <w:rPr>
+          <w:rFonts w:ascii="Courier New" w:hAnsi="Courier New"/>
+          <w:color w:val="1E1E1E"/>
+          <w:sz w:val="18"/>
+        </w:rPr>
+        <w:t>ratio_extHyperlinks</w:t>
+      </w:r>
+      <w:proofErr w:type="spellEnd"/>
+    </w:p>
+    <w:p>
+      <w:pPr>
+        <w:ind w:left="432"/>
+        <w:rPr>
+          <w:rFonts w:ascii="Courier New" w:hAnsi="Courier New"/>
+          <w:color w:val="1E1E1E"/>
+          <w:sz w:val="18"/>
+        </w:rPr>
+      </w:pPr>
+      <w:r>
+        <w:rPr>
+          <w:rFonts w:ascii="Courier New" w:hAnsi="Courier New"/>
+          <w:color w:val="1E1E1E"/>
+          <w:sz w:val="18"/>
+        </w:rPr>
+        <w:t>, </w:t>
+      </w:r>
+    </w:p>
+    <w:p>
+      <w:pPr>
+        <w:ind w:left="432"/>
+        <w:rPr>
+          <w:rFonts w:ascii="Courier New" w:hAnsi="Courier New"/>
+          <w:color w:val="1E1E1E"/>
+          <w:sz w:val="18"/>
+        </w:rPr>
+      </w:pPr>
+      <w:proofErr w:type="spellStart"/>
+      <w:r>
+        <w:rPr>
+          <w:rFonts w:ascii="Courier New" w:hAnsi="Courier New"/>
+          <w:color w:val="1E1E1E"/>
+          <w:sz w:val="18"/>
+        </w:rPr>
+        <w:t>nb_extCSS</w:t>
+      </w:r>
+      <w:proofErr w:type="spellEnd"/>
+    </w:p>
+    <w:p>
+      <w:pPr>
+        <w:ind w:left="432"/>
+        <w:rPr>
+          <w:rFonts w:ascii="Courier New" w:hAnsi="Courier New"/>
+          <w:color w:val="1E1E1E"/>
+          <w:sz w:val="18"/>
+        </w:rPr>
+      </w:pPr>
+      <w:r>
+        <w:rPr>
+          <w:rFonts w:ascii="Courier New" w:hAnsi="Courier New"/>
+          <w:color w:val="1E1E1E"/>
+          <w:sz w:val="18"/>
+        </w:rPr>
+        <w:t>, </w:t>
+      </w:r>
+    </w:p>
+    <w:p>
+      <w:pPr>
+        <w:ind w:left="432"/>
+        <w:rPr>
+          <w:rFonts w:ascii="Courier New" w:hAnsi="Courier New"/>
+          <w:color w:val="1E1E1E"/>
+          <w:sz w:val="18"/>
+        </w:rPr>
+      </w:pPr>
+      <w:proofErr w:type="spellStart"/>
+      <w:r>
+        <w:rPr>
+          <w:rFonts w:ascii="Courier New" w:hAnsi="Courier New"/>
+          <w:color w:val="1E1E1E"/>
+          <w:sz w:val="18"/>
+        </w:rPr>
+        <w:t>external_favicon</w:t>
+      </w:r>
+      <w:proofErr w:type="spellEnd"/>
+    </w:p>
+    <w:p>
+      <w:pPr>
+        <w:ind w:left="432"/>
+        <w:rPr>
+          <w:rFonts w:ascii="Courier New" w:hAnsi="Courier New"/>
+          <w:color w:val="1E1E1E"/>
+          <w:sz w:val="18"/>
+        </w:rPr>
+      </w:pPr>
+      <w:r>
+        <w:rPr>
+          <w:rFonts w:ascii="Courier New" w:hAnsi="Courier New"/>
+          <w:color w:val="1E1E1E"/>
+          <w:sz w:val="18"/>
+        </w:rPr>
+        <w:t> etc., all of which push the score up.</w:t>
+      </w:r>
+    </w:p>
+    <w:p>
+      <w:pPr>
+        <w:ind w:left="432"/>
+        <w:rPr>
+          <w:rFonts w:ascii="Courier New" w:hAnsi="Courier New"/>
+          <w:color w:val="1E1E1E"/>
+          <w:sz w:val="18"/>
+        </w:rPr>
+      </w:pPr>
+    </w:p>
+    <w:p>
+      <w:pPr>
+        <w:ind w:left="432"/>
+        <w:rPr>
+          <w:rFonts w:ascii="Courier New" w:hAnsi="Courier New"/>
+          <w:color w:val="1E1E1E"/>
+          <w:sz w:val="18"/>
+        </w:rPr>
+      </w:pPr>
+    </w:p>
+    <w:p>
+      <w:pPr>
+        <w:pBdr>
+          <w:bottom w:val="single" w:sz="6" w:space="1" w:color="auto"/>
+        </w:pBdr>
+        <w:ind w:left="432"/>
+        <w:rPr>
+          <w:rFonts w:ascii="Courier New" w:hAnsi="Courier New"/>
+          <w:color w:val="1E1E1E"/>
+          <w:sz w:val="18"/>
+        </w:rPr>
+      </w:pPr>
+    </w:p>
+    <w:p>
+      <w:pPr>
+        <w:ind w:left="432"/>
+        <w:rPr>
+          <w:rFonts w:ascii="Courier New" w:hAnsi="Courier New"/>
+          <w:b/>
+          <w:bCs/>
+          <w:color w:val="1E1E1E"/>
+          <w:sz w:val="18"/>
+        </w:rPr>
+      </w:pPr>
+      <w:r>
+        <w:rPr>
+          <w:rFonts w:ascii="Courier New" w:hAnsi="Courier New"/>
+          <w:color w:val="1E1E1E"/>
+          <w:sz w:val="18"/>
+        </w:rPr>
+        <w:t xml:space="preserve">The </w:t>
+      </w:r>
+      <w:proofErr w:type="spellStart"/>
+      <w:r>
+        <w:rPr>
+          <w:rFonts w:ascii="Courier New" w:hAnsi="Courier New"/>
+          <w:color w:val="1E1E1E"/>
+          <w:sz w:val="18"/>
+        </w:rPr>
+        <w:t>api</w:t>
+      </w:r>
+      <w:proofErr w:type="spellEnd"/>
+      <w:r>
+        <w:rPr>
+          <w:rFonts w:ascii="Courier New" w:hAnsi="Courier New"/>
+          <w:color w:val="1E1E1E"/>
+          <w:sz w:val="18"/>
+        </w:rPr>
+        <w:t xml:space="preserve"> giving 0 result </w:t>
+      </w:r>
+      <w:r>
+        <w:rPr>
+          <w:rFonts w:ascii="Courier New" w:hAnsi="Courier New"/>
+          <w:color w:val="1E1E1E"/>
+          <w:sz w:val="18"/>
+        </w:rPr>
+        <w:br/>
+      </w:r>
+      <w:r>
+        <w:rPr>
+          <w:rFonts w:ascii="Courier New" w:hAnsi="Courier New"/>
+          <w:b/>
+          <w:bCs/>
+          <w:color w:val="1E1E1E"/>
+          <w:sz w:val="18"/>
+        </w:rPr>
+        <w:t>1. The fallback values on API failure look like hardcoded zeros</w:t>
+      </w:r>
+    </w:p>
+    <w:p>
+      <w:pPr>
+        <w:ind w:left="432"/>
+        <w:rPr>
+          <w:rFonts w:ascii="Courier New" w:hAnsi="Courier New"/>
+          <w:color w:val="1E1E1E"/>
+          <w:sz w:val="18"/>
+        </w:rPr>
+      </w:pPr>
+      <w:r>
+        <w:rPr>
+          <w:rFonts w:ascii="Courier New" w:hAnsi="Courier New"/>
+          <w:color w:val="1E1E1E"/>
+          <w:sz w:val="18"/>
+        </w:rPr>
+        <w:t>When any API call fails (timeout, rate limit, bad key), every </w:t>
+      </w:r>
+    </w:p>
+    <w:p>
+      <w:pPr>
+        <w:ind w:left="432"/>
+        <w:rPr>
+          <w:rFonts w:ascii="Courier New" w:hAnsi="Courier New"/>
+          <w:color w:val="1E1E1E"/>
+          <w:sz w:val="18"/>
+        </w:rPr>
+      </w:pPr>
+      <w:r>
+        <w:rPr>
+          <w:rFonts w:ascii="Courier New" w:hAnsi="Courier New"/>
+          <w:color w:val="1E1E1E"/>
+          <w:sz w:val="18"/>
+        </w:rPr>
+        <w:t>E</w:t>
+      </w:r>
+      <w:r>
+        <w:rPr>
+          <w:rFonts w:ascii="Courier New" w:hAnsi="Courier New"/>
+          <w:color w:val="1E1E1E"/>
+          <w:sz w:val="18"/>
+        </w:rPr>
+        <w:t>xcept</w:t>
+      </w:r>
+      <w:r>
+        <w:rPr>
+          <w:rFonts w:ascii="Courier New" w:hAnsi="Courier New"/>
+          <w:color w:val="1E1E1E"/>
+          <w:sz w:val="18"/>
+        </w:rPr>
+        <w:t xml:space="preserve"> </w:t>
+      </w:r>
+      <w:r>
+        <w:rPr>
+          <w:rFonts w:ascii="Courier New" w:hAnsi="Courier New"/>
+          <w:color w:val="1E1E1E"/>
+          <w:sz w:val="18"/>
+        </w:rPr>
+        <w:t>block returns:</w:t>
+      </w:r>
+    </w:p>
+    <w:p>
+      <w:pPr>
+        <w:ind w:left="432"/>
+        <w:rPr>
+          <w:rFonts w:ascii="Courier New" w:hAnsi="Courier New"/>
+          <w:color w:val="1E1E1E"/>
+          <w:sz w:val="18"/>
+        </w:rPr>
+      </w:pPr>
+      <w:r>
+        <w:rPr>
+          <w:rFonts w:ascii="Courier New" w:hAnsi="Courier New"/>
+          <w:b/>
+          <w:bCs/>
+          <w:color w:val="1E1E1E"/>
+          <w:sz w:val="18"/>
+        </w:rPr>
+        <w:t xml:space="preserve">2. </w:t>
+      </w:r>
+      <w:r>
+        <w:rPr>
+          <w:rFonts w:ascii="Courier New" w:hAnsi="Courier New"/>
+          <w:b/>
+          <w:bCs/>
+          <w:color w:val="1E1E1E"/>
+          <w:sz w:val="18"/>
+        </w:rPr>
+        <w:t>The ML model features ARE hardcoded zeros </w:t>
+      </w:r>
+      <w:r>
+        <w:rPr>
+          <w:rFonts w:ascii="Courier New" w:hAnsi="Courier New"/>
+          <w:color w:val="1E1E1E"/>
+          <w:sz w:val="18"/>
+        </w:rPr>
+        <w:t>— but that's a different issue (the one causing the false positive score</w:t>
+      </w:r>
+    </w:p>
+    <w:p>
+      <w:pPr>
+        <w:ind w:left="432"/>
+        <w:rPr>
+          <w:rFonts w:ascii="Courier New" w:hAnsi="Courier New"/>
+          <w:color w:val="1E1E1E"/>
+          <w:sz w:val="18"/>
+        </w:rPr>
+      </w:pPr>
+    </w:p>
+    <w:p>
+      <w:pPr>
+        <w:ind w:left="432"/>
+        <w:rPr>
+          <w:rFonts w:ascii="Courier New" w:hAnsi="Courier New"/>
+          <w:color w:val="1E1E1E"/>
+          <w:sz w:val="18"/>
+        </w:rPr>
+      </w:pPr>
+      <w:r>
+        <w:rPr>
+          <w:rFonts w:ascii="Courier New" w:hAnsi="Courier New"/>
+          <w:color w:val="1E1E1E"/>
+          <w:sz w:val="18"/>
+        </w:rPr>
+        <w:lastRenderedPageBreak/>
+        <w:drawing>
+          <wp:inline distT="0" distB="0" distL="0" distR="0" wp14:anchorId="11097F67" wp14:editId="34695F72">
+            <wp:extent cx="3810532" cy="4820323"/>
+            <wp:effectExtent l="0" t="0" r="0" b="0"/>
+            <wp:docPr id="1410766335" name="Picture 1"/>
+            <wp:cNvGraphicFramePr>
+              <a:graphicFrameLocks xmlns:a="http://schemas.openxmlformats.org/drawingml/2006/main" noChangeAspect="1"/>
+            </wp:cNvGraphicFramePr>
+            <a:graphic xmlns:a="http://schemas.openxmlformats.org/drawingml/2006/main">
+              <a:graphicData uri="http://schemas.openxmlformats.org/drawingml/2006/picture">
+                <pic:pic xmlns:pic="http://schemas.openxmlformats.org/drawingml/2006/picture">
+                  <pic:nvPicPr>
+                    <pic:cNvPr id="1410766335" name=""/>
+                    <pic:cNvPicPr/>
+                  </pic:nvPicPr>
+                  <pic:blipFill>
+                    <a:blip r:embed="rId6"/>
+                    <a:stretch>
+                      <a:fillRect/>
+                    </a:stretch>
+                  </pic:blipFill>
+                  <pic:spPr>
+                    <a:xfrm>
+                      <a:off x="0" y="0"/>
+                      <a:ext cx="3810532" cy="4820323"/>
+                    </a:xfrm>
+                    <a:prstGeom prst="rect">
+                      <a:avLst/>
+                    </a:prstGeom>
+                  </pic:spPr>
+                </pic:pic>
+              </a:graphicData>
+            </a:graphic>
+          </wp:inline>
+        </w:drawing>
+      </w:r>
+    </w:p>
+    <w:p>
+      <w:pPr>
+        <w:ind w:left="432"/>
+        <w:rPr>
+          <w:rFonts w:ascii="Courier New" w:hAnsi="Courier New"/>
+          <w:color w:val="1E1E1E"/>
+          <w:sz w:val="18"/>
+        </w:rPr>
+      </w:pPr>
+    </w:p>
+    <w:p>
+      <w:pPr>
+        <w:ind w:left="432"/>
+        <w:rPr>
+          <w:rFonts w:ascii="Courier New" w:hAnsi="Courier New"/>
+          <w:color w:val="1E1E1E"/>
+          <w:sz w:val="18"/>
+        </w:rPr>
+      </w:pPr>
+      <w:r>
+        <w:rPr>
+          <w:rFonts w:ascii="Courier New" w:hAnsi="Courier New"/>
+          <w:color w:val="1E1E1E"/>
+          <w:sz w:val="18"/>
+        </w:rPr>
+        <w:lastRenderedPageBreak/>
+        <w:drawing>
+          <wp:inline distT="0" distB="0" distL="0" distR="0" wp14:anchorId="5C6F4175" wp14:editId="332F0FFA">
+            <wp:extent cx="3877216" cy="6030167"/>
+            <wp:effectExtent l="0" t="0" r="9525" b="8890"/>
+            <wp:docPr id="1536110487" name="Picture 1"/>
+            <wp:cNvGraphicFramePr>
+              <a:graphicFrameLocks xmlns:a="http://schemas.openxmlformats.org/drawingml/2006/main" noChangeAspect="1"/>
+            </wp:cNvGraphicFramePr>
+            <a:graphic xmlns:a="http://schemas.openxmlformats.org/drawingml/2006/main">
+              <a:graphicData uri="http://schemas.openxmlformats.org/drawingml/2006/picture">
+                <pic:pic xmlns:pic="http://schemas.openxmlformats.org/drawingml/2006/picture">
+                  <pic:nvPicPr>
+                    <pic:cNvPr id="1536110487" name=""/>
+                    <pic:cNvPicPr/>
+                  </pic:nvPicPr>
+                  <pic:blipFill>
+                    <a:blip r:embed="rId7"/>
+                    <a:stretch>
+                      <a:fillRect/>
+                    </a:stretch>
+                  </pic:blipFill>
+                  <pic:spPr>
+                    <a:xfrm>
+                      <a:off x="0" y="0"/>
+                      <a:ext cx="3877216" cy="6030167"/>
+                    </a:xfrm>
+                    <a:prstGeom prst="rect">
+                      <a:avLst/>
+                    </a:prstGeom>
+                  </pic:spPr>
+                </pic:pic>
+              </a:graphicData>
+            </a:graphic>
+          </wp:inline>
+        </w:drawing>
+      </w:r>
+    </w:p>
+    <w:p>
+      <w:pPr>
+        <w:ind w:left="432"/>
+        <w:rPr>
+          <w:rFonts w:ascii="Courier New" w:hAnsi="Courier New"/>
+          <w:color w:val="1E1E1E"/>
+          <w:sz w:val="18"/>
+        </w:rPr>
+      </w:pPr>
+    </w:p>
+    <w:p>
+      <w:pPr>
+        <w:ind w:left="432"/>
+        <w:rPr>
+          <w:rFonts w:ascii="Courier New" w:hAnsi="Courier New"/>
+          <w:color w:val="1E1E1E"/>
+          <w:sz w:val="18"/>
+        </w:rPr>
+      </w:pPr>
+    </w:p>
+    <w:p>
+      <w:pPr>
+        <w:ind w:left="432"/>
+      </w:pPr>
     </w:p>
     <w:sectPr>
       <w:pgSz w:w="12240" w:h="15840"/>
-      <w:pgMar w:top="1440" w:right="1800" w:bottom="1440" w:left="1800" w:header="720" w:footer="720" w:gutter="0"/>
+      <w:pgMar w:top="720" w:right="720" w:bottom="720" w:left="720" w:header="720" w:footer="720" w:gutter="0"/>
       <w:cols w:space="720"/>
       <w:docGrid w:linePitch="360"/>
     </w:sectPr>
@@ -2908,6 +4225,155 @@
       </w:pPr>
       <w:rPr>
         <w:rFonts w:ascii="Symbol" w:hAnsi="Symbol" w:hint="default"/>
+      </w:rPr>
+    </w:lvl>
+  </w:abstractNum>
+  <w:abstractNum w:abstractNumId="9" w15:restartNumberingAfterBreak="0">
+    <w:nsid w:val="58B71C89"/>
+    <w:multiLevelType w:val="multilevel"/>
+    <w:tmpl w:val="E70C360E"/>
+    <w:lvl w:ilvl="0">
+      <w:start w:val="1"/>
+      <w:numFmt w:val="bullet"/>
+      <w:lvlText w:val=""/>
+      <w:lvlJc w:val="left"/>
+      <w:pPr>
+        <w:tabs>
+          <w:tab w:val="num" w:pos="720"/>
+        </w:tabs>
+        <w:ind w:left="720" w:hanging="360"/>
+      </w:pPr>
+      <w:rPr>
+        <w:rFonts w:ascii="Symbol" w:hAnsi="Symbol" w:hint="default"/>
+        <w:sz w:val="20"/>
+      </w:rPr>
+    </w:lvl>
+    <w:lvl w:ilvl="1" w:tentative="1">
+      <w:start w:val="1"/>
+      <w:numFmt w:val="bullet"/>
+      <w:lvlText w:val="o"/>
+      <w:lvlJc w:val="left"/>
+      <w:pPr>
+        <w:tabs>
+          <w:tab w:val="num" w:pos="1440"/>
+        </w:tabs>
+        <w:ind w:left="1440" w:hanging="360"/>
+      </w:pPr>
+      <w:rPr>
+        <w:rFonts w:ascii="Courier New" w:hAnsi="Courier New" w:hint="default"/>
+        <w:sz w:val="20"/>
+      </w:rPr>
+    </w:lvl>
+    <w:lvl w:ilvl="2" w:tentative="1">
+      <w:start w:val="1"/>
+      <w:numFmt w:val="bullet"/>
+      <w:lvlText w:val=""/>
+      <w:lvlJc w:val="left"/>
+      <w:pPr>
+        <w:tabs>
+          <w:tab w:val="num" w:pos="2160"/>
+        </w:tabs>
+        <w:ind w:left="2160" w:hanging="360"/>
+      </w:pPr>
+      <w:rPr>
+        <w:rFonts w:ascii="Wingdings" w:hAnsi="Wingdings" w:hint="default"/>
+        <w:sz w:val="20"/>
+      </w:rPr>
+    </w:lvl>
+    <w:lvl w:ilvl="3" w:tentative="1">
+      <w:start w:val="1"/>
+      <w:numFmt w:val="bullet"/>
+      <w:lvlText w:val=""/>
+      <w:lvlJc w:val="left"/>
+      <w:pPr>
+        <w:tabs>
+          <w:tab w:val="num" w:pos="2880"/>
+        </w:tabs>
+        <w:ind w:left="2880" w:hanging="360"/>
+      </w:pPr>
+      <w:rPr>
+        <w:rFonts w:ascii="Wingdings" w:hAnsi="Wingdings" w:hint="default"/>
+        <w:sz w:val="20"/>
+      </w:rPr>
+    </w:lvl>
+    <w:lvl w:ilvl="4" w:tentative="1">
+      <w:start w:val="1"/>
+      <w:numFmt w:val="bullet"/>
+      <w:lvlText w:val=""/>
+      <w:lvlJc w:val="left"/>
+      <w:pPr>
+        <w:tabs>
+          <w:tab w:val="num" w:pos="3600"/>
+        </w:tabs>
+        <w:ind w:left="3600" w:hanging="360"/>
+      </w:pPr>
+      <w:rPr>
+        <w:rFonts w:ascii="Wingdings" w:hAnsi="Wingdings" w:hint="default"/>
+        <w:sz w:val="20"/>
+      </w:rPr>
+    </w:lvl>
+    <w:lvl w:ilvl="5" w:tentative="1">
+      <w:start w:val="1"/>
+      <w:numFmt w:val="bullet"/>
+      <w:lvlText w:val=""/>
+      <w:lvlJc w:val="left"/>
+      <w:pPr>
+        <w:tabs>
+          <w:tab w:val="num" w:pos="4320"/>
+        </w:tabs>
+        <w:ind w:left="4320" w:hanging="360"/>
+      </w:pPr>
+      <w:rPr>
+        <w:rFonts w:ascii="Wingdings" w:hAnsi="Wingdings" w:hint="default"/>
+        <w:sz w:val="20"/>
+      </w:rPr>
+    </w:lvl>
+    <w:lvl w:ilvl="6" w:tentative="1">
+      <w:start w:val="1"/>
+      <w:numFmt w:val="bullet"/>
+      <w:lvlText w:val=""/>
+      <w:lvlJc w:val="left"/>
+      <w:pPr>
+        <w:tabs>
+          <w:tab w:val="num" w:pos="5040"/>
+        </w:tabs>
+        <w:ind w:left="5040" w:hanging="360"/>
+      </w:pPr>
+      <w:rPr>
+        <w:rFonts w:ascii="Wingdings" w:hAnsi="Wingdings" w:hint="default"/>
+        <w:sz w:val="20"/>
+      </w:rPr>
+    </w:lvl>
+    <w:lvl w:ilvl="7" w:tentative="1">
+      <w:start w:val="1"/>
+      <w:numFmt w:val="bullet"/>
+      <w:lvlText w:val=""/>
+      <w:lvlJc w:val="left"/>
+      <w:pPr>
+        <w:tabs>
+          <w:tab w:val="num" w:pos="5760"/>
+        </w:tabs>
+        <w:ind w:left="5760" w:hanging="360"/>
+      </w:pPr>
+      <w:rPr>
+        <w:rFonts w:ascii="Wingdings" w:hAnsi="Wingdings" w:hint="default"/>
+        <w:sz w:val="20"/>
+      </w:rPr>
+    </w:lvl>
+    <w:lvl w:ilvl="8" w:tentative="1">
+      <w:start w:val="1"/>
+      <w:numFmt w:val="bullet"/>
+      <w:lvlText w:val=""/>
+      <w:lvlJc w:val="left"/>
+      <w:pPr>
+        <w:tabs>
+          <w:tab w:val="num" w:pos="6480"/>
+        </w:tabs>
+        <w:ind w:left="6480" w:hanging="360"/>
+      </w:pPr>
+      <w:rPr>
+        <w:rFonts w:ascii="Wingdings" w:hAnsi="Wingdings" w:hint="default"/>
+        <w:sz w:val="20"/>
       </w:rPr>
     </w:lvl>
   </w:abstractNum>
@@ -2937,6 +4403,9 @@
   </w:num>
   <w:num w:numId="9" w16cid:durableId="1429696076">
     <w:abstractNumId w:val="0"/>
+  </w:num>
+  <w:num w:numId="10" w16cid:durableId="262304545">
+    <w:abstractNumId w:val="9"/>
   </w:num>
 </w:numbering>
 </file>
@@ -14320,6 +15789,29 @@
       </w:tcPr>
     </w:tblStylePr>
   </w:style>
+  <w:style w:type="character" w:styleId="Hyperlink">
+    <w:name w:val="Hyperlink"/>
+    <w:basedOn w:val="DefaultParagraphFont"/>
+    <w:uiPriority w:val="99"/>
+    <w:unhideWhenUsed/>
+    <w:rsid w:val="0032566B"/>
+    <w:rPr>
+      <w:color w:val="0000FF" w:themeColor="hyperlink"/>
+      <w:u w:val="single"/>
+    </w:rPr>
+  </w:style>
+  <w:style w:type="character" w:styleId="UnresolvedMention">
+    <w:name w:val="Unresolved Mention"/>
+    <w:basedOn w:val="DefaultParagraphFont"/>
+    <w:uiPriority w:val="99"/>
+    <w:semiHidden/>
+    <w:unhideWhenUsed/>
+    <w:rsid w:val="0032566B"/>
+    <w:rPr>
+      <w:color w:val="605E5C"/>
+      <w:shd w:val="clear" w:color="auto" w:fill="E1DFDD"/>
+    </w:rPr>
+  </w:style>
 </w:styles>
 </file>
 

</xml_diff>